<commit_message>
court(oklacrimapp): petition for rehearing gated on the model's spaced-ellipsis rule (fb-595.54.61)
Engines regenerated on master's model; latex and docx 547/547 lines, tier 1 0 failed.

Co-Authored-By: Claude Opus 5.5 <noreply@anthropic.com>
</commit_message>
<xml_diff>
--- a/courts/tenth-circuit/oklahoma/state/court-of-criminal-appeals/petition-for-rehearing/usage/OUTPUT-petition-for-rehearing.docx
+++ b/courts/tenth-circuit/oklahoma/state/court-of-criminal-appeals/petition-for-rehearing/usage/OUTPUT-petition-for-rehearing.docx
@@ -222,13 +222,6 @@
     </w:p>
     <w:p>
       <w:pPr>
-        <w:spacing w:before="0" w:after="0" w:line="299" w:lineRule="exact"/>
-        <w:ind w:left="4320" w:firstLine="0"/>
-        <w:jc w:val="left"/>
-      </w:pPr>
-    </w:p>
-    <w:p>
-      <w:pPr>
         <w:spacing w:before="130" w:after="0" w:line="299" w:lineRule="exact"/>
         <w:ind w:left="0" w:firstLine="0"/>
         <w:jc w:val="center"/>
@@ -1130,113 +1123,101 @@
         <w:pStyle w:val="BodyText"/>
       </w:pPr>
       <w:r>
-        <w:t xml:space="preserve">First, the Court overlooked the State’s textual argument on the General Crimes Act (1$ U.S.C. § 1152) by holding that the State’s jurisdiction is contrary to the “clear language of. . . (the] statute.” Bosse, 2021 OK CR 3, ¶ 23</w:t>
+        <w:t xml:space="preserve">First, the Court overlooked the State’s textual argument on the General Crimes Act (1$ U.S.C. § 1152) by holding that the State’s jurisdiction is contrary to the “clear language of. . . (the] statute.” Bosse, 2021 OK CR 3, ¶ 23-⁠24, P.3d at . in fact, while the General Crimes Act grants the federal government jurisdiction over certain crimes in Indian country, nothing in that Act explicitly preempts the State’s jurisdiction (see State’s Response at 13</w:t>
       </w:r>
       <w:r>
         <w:noBreakHyphen/>
       </w:r>
       <w:r>
-        <w:t xml:space="preserve">24, P.3d at . in fact, while the General Crimes Act grants the federal government jurisdiction over certain crimes in Indian country, nothing in that Act explicitly preempts the State’s jurisdiction (see State’s Response at 13</w:t>
+        <w:t xml:space="preserve">14; State’s Supplemental Brief at 13</w:t>
       </w:r>
       <w:r>
         <w:noBreakHyphen/>
       </w:r>
       <w:r>
-        <w:t xml:space="preserve">14; State’s Supplemental Brief at 13</w:t>
+        <w:t xml:space="preserve">14). As explained, the reference to “the sole and exclusive jurisdiction of the United States” is used to designate the substantive law extended to Indian country—i.e. those laws that apply to federal enclaves such as military bases or national forests (except for the District of Columbia)— not to declare that the federal jurisdiction granted by the General Crimes Act is exclusive. Or as the Supreme Court put it, those words “do not mean that the United States must have sole and exclusive jurisdiction over the Indian country in order that that section may apply to it; the words are used in order to describe the laws of the United States, which, by that section, are extended to the Indian country.” Donnelly u. United States, 22$ U.S. 243, 268 (1913) (citing Exparte Wilson, 140 U.S. 575, 578 (1891)).</w:t>
+      </w:r>
+    </w:p>
+    <w:p>
+      <w:pPr>
+        <w:pStyle w:val="BodyText"/>
+      </w:pPr>
+      <w:r>
+        <w:t xml:space="preserve">This Court attempted to distinguish Ex parte Wilson by noting that the Supreme Court’s interpretation of the text of the General Crimes Act in that case arose in a different context. Bosse, 2021 OK CR 3, ¶ 24 n. 10, — P.3d at —. But that cases like Wilson and Donnelly involved different facts doesn’t change the meaning of the text of the General Crimes Act, where the phrase “sole and exclusive” does not define the scope of the United States’jurisdiction (but instead defines the law to be applied) and no other text in the Act otherwise preempts state jurisdiction. To hold that the meaning of the text changes with the facts of a case ‘“would render every statute a chameleon,’ and ‘would establish within our jurisprudence . . . the dangerous principle that judges can give the same statutory text different meanings in different cases.” United States v. Santos. 553 U.S. 507, 522 (2008) (quoting Clark v. Martinez, 543 U.S. 371, 37$ (2005)) (internal citations omitted); see also United States u. Heon Seok Lee, 937 F.3d 797, 813 (7th Cir. 2019); Patel v. Napolitano, 706 F.3d 370, 376 (4th Cir, 2013); United Rentals Nw., Inc. u. Yearout Mech., Inc., 573 f.3d 997, 1001 f 10th Cir. 2009) (“Statutory interpretation presents a question of law, and the facts of an individual case will not affect a court’s interpretation of a statute.”).</w:t>
+      </w:r>
+    </w:p>
+    <w:p>
+      <w:pPr>
+        <w:pStyle w:val="BodyText"/>
+      </w:pPr>
+      <w:r>
+        <w:t xml:space="preserve">Thus, the phrase “sole and exclusive jurisdiction of the United States” designates the law to be applied in federal courts and does not preempt state jurisdiction, nor did this Court point to any other text in the General Crimes Act that would preempt state jurisdiction.</w:t>
+      </w:r>
+    </w:p>
+    <w:p>
+      <w:pPr>
+        <w:pStyle w:val="BodyText"/>
+      </w:pPr>
+      <w:r>
+        <w:t xml:space="preserve">Second, this Court appears to have presumed that “where federal jurisdiction exists by statute, states [do not] have concurrent jurisdiction as well.” Bosse, 2021 OK CR 3, ¶ 24, — P.3d at . But that overlooks the State’s argument that the exact opposite is true: even where the federal government has jurisdiction, there is a deeply-rooted presumption that states have jurisdiction concurrent with the federal government unless Congress clearly and unmistakably expresses otherwise (State’s Response at 16</w:t>
       </w:r>
       <w:r>
         <w:noBreakHyphen/>
       </w:r>
       <w:r>
-        <w:t xml:space="preserve">14). As explained, the reference to “the sole and exclusive jurisdiction of the United States” is used to designate the substantive law extended to Indian country—i.e. those laws that apply to federal enclaves such as military bases or national forests (except for the District of Columbia)— not to declare that the federal jurisdiction granted by the General Crimes Act is exclusive. Or as the Supreme Court put it, those words “do not mean that the United States must have sole and exclusive jurisdiction over the Indian country in order that that section may apply to it; the words are used in order to describe the laws of the United States, which, by that section, are extended to the Indian country.” Donnelly u. United States, 22$ U.S. 243, 268 (1913) (citing Exparte Wilson, 140 U.S. 575, 578 (1891)).</w:t>
-      </w:r>
-    </w:p>
-    <w:p>
-      <w:pPr>
-        <w:pStyle w:val="BodyText"/>
-      </w:pPr>
-      <w:r>
-        <w:t xml:space="preserve">This Court attempted to distinguish Ex parte Wilson by noting that the Supreme Court’s interpretation of the text of the General Crimes Act in that case arose in a different context. Bosse, 2021 OK CR 3, ¶ 24 n. 10, — P.3d at —. But that cases like Wilson and Donnelly involved different facts doesn’t change the meaning of the text of the General Crimes Act, where the phrase “sole and exclusive” does not define the scope of the United States’jurisdiction (but instead defines the law to be applied) and no other text in the Act otherwise preempts state jurisdiction. To hold that the meaning of the text changes with the facts of a case ‘“would render every statute a chameleon,’ and ‘would establish within our jurisprudence . . . the dangerous principle that judges can give the same statutory text different meanings in different cases.” United States v. Santos. 553 U.S. 507, 522 (2008) (quoting Clark v. Martinez, 543 U.S. 371, 37$ (2005)) (internal citations omitted); see also United States u. Heon Seok Lee, 937 F.3d 797, 813 (7th Cir. 2019); Patel v. Napolitano, 706 F.3d 370, 376 (4th Cir, 2013); United Rentals Nw., Inc. u. Yearout Mech., Inc., 573 f.3d 997, 1001 f 10th Cir. 2009) (“Statutory interpretation presents a question of law, and the facts of an individual case will not affect a court’s interpretation of a statute.”).</w:t>
-      </w:r>
-    </w:p>
-    <w:p>
-      <w:pPr>
-        <w:pStyle w:val="BodyText"/>
-      </w:pPr>
-      <w:r>
-        <w:t xml:space="preserve">Thus, the phrase “sole and exclusive jurisdiction of the United States” designates the law to be applied in federal courts and does not preempt state jurisdiction, nor did this Court point to any other text in the General Crimes Act that would preempt state jurisdiction.</w:t>
-      </w:r>
-    </w:p>
-    <w:p>
-      <w:pPr>
-        <w:pStyle w:val="BodyText"/>
-      </w:pPr>
-      <w:r>
-        <w:t xml:space="preserve">Second, this Court appears to have presumed that “where federal jurisdiction exists by statute, states [do not] have concurrent jurisdiction as well.” Bosse, 2021 OK CR 3, ¶ 24, — P.3d at . But that overlooks the State’s argument that the exact opposite is true: even where the federal government has jurisdiction, there is a deeply-rooted presumption that states have jurisdiction concurrent with the federal government unless Congress clearly and unmistakably expresses otherwise (State’s Response at 16</w:t>
+        <w:t xml:space="preserve">17 (citing Atl. Richfield Co. v. Christian, 140 S. Ct. 1335, 1349</w:t>
       </w:r>
       <w:r>
         <w:noBreakHyphen/>
       </w:r>
       <w:r>
-        <w:t xml:space="preserve">17 (citing Atl. Richfield Co. v. Christian, 140 S. Ct. 1335, 1349</w:t>
+        <w:t xml:space="preserve">52 (2020); Gulf Offshore Co. u. Mobil Oil Corp,, 453 U.S. 473, 478 (1l); Silas Mason Co i’ Ta Com’n af Slate of Washington, 302 U.S. 186, 207 (1937); United States a. Bank of New York &amp; Tr. Co., 2Q6 U.S. 463, 479 (1936); Claflin a. Houseman, 93 U.S. 130, 134 (1876))). This Court’s ruling similarly overlooks the State’s argument on the more general presumption against preemption (State’s Response at 15 (citing Wyeth v. Leuine, 555 U.S. 555, 565 (2009))).</w:t>
+      </w:r>
+    </w:p>
+    <w:p>
+      <w:pPr>
+        <w:pStyle w:val="BodyText"/>
+      </w:pPr>
+      <w:r>
+        <w:t xml:space="preserve">Thus, this Court’s invocation of Donnelly is inapposite because in that case</w:t>
+      </w:r>
+    </w:p>
+    <w:p>
+      <w:pPr>
+        <w:pStyle w:val="BodyText"/>
+      </w:pPr>
+      <w:r>
+        <w:t xml:space="preserve">crimes the Supreme Court held that the federal government has jurisdiction over committed by or against Indians under the General Crimes Act, not that the State lacks such jurisdiction. Nor does this Court’s invocation of United States</w:t>
+      </w:r>
+    </w:p>
+    <w:p>
+      <w:pPr>
+        <w:pStyle w:val="BodyText"/>
+      </w:pPr>
+      <w:r>
+        <w:t xml:space="preserve">was v. John, 437 U.S. 634, 651 (1978) answer the question, because that case interpreting the Major Crimes Act (18 U.S.C. § 1 153), which has a text distinct from that of the General Crimes Act. Specifically, the Major Crimes Act defines</w:t>
+      </w:r>
+    </w:p>
+    <w:p>
+      <w:pPr>
+        <w:pStyle w:val="BodyText"/>
+      </w:pPr>
+      <w:r>
+        <w:t xml:space="preserve">“within the applicable law and then says punishment for violation of those laws is the exclusive jurisdiction of the United States.” 18 U.S.C. § 1153. By contrast, as stated above, the General Crimes Act merely defines the applicable law and then extends that law to the Indian Country, without saying anything about jurisdiction—leaving the presumption that federal and state courts exercise concurrent jurisdiction in place.</w:t>
+      </w:r>
+    </w:p>
+    <w:p>
+      <w:pPr>
+        <w:pStyle w:val="BodyText"/>
+      </w:pPr>
+      <w:r>
+        <w:t xml:space="preserve">Third, this Court pointed to the Kansas Act, 1$ U.S.C. § 3243, and Public Law 280, Act of Aug. 15, 1953, Pub. L. No. 67, Stat. 588, codified at 18 U.S.C. § 1162, 25 U.S.C. § 1321-⁠26; 18 U.S.C. § 1162(a), which conferred on certain states jurisdiction over crimes by or against Indians, as implicitly recognizing that states otherwise lack jurisdiction over non Indians who offend against Indians. Bossc, 2021 OX CR3, ¶j 25</w:t>
       </w:r>
       <w:r>
         <w:noBreakHyphen/>
       </w:r>
       <w:r>
-        <w:t xml:space="preserve">52 (2020); Gulf Offshore Co. u. Mobil Oil Corp,, 453 U.S. 473, 478 (1l); Silas Mason Co i’ Ta Com’n af Slate of Washington, 302 U.S. 186, 207 (1937); United States a. Bank of New York &amp; Tr. Co., 2Q6 U.S. 463, 479 (1936); Claflin a. Houseman, 93 U.S. 130, 134 (1876))). This Court’s ruling similarly overlooks the State’s argument on the more general presumption against preemption (State’s Response at 15 (citing Wyeth v. Leuine, 555 U.S. 555, 565 (2009))).</w:t>
-      </w:r>
-    </w:p>
-    <w:p>
-      <w:pPr>
-        <w:pStyle w:val="BodyText"/>
-      </w:pPr>
-      <w:r>
-        <w:t xml:space="preserve">Thus, this Court’s invocation of Donnelly is inapposite because in that case</w:t>
-      </w:r>
-    </w:p>
-    <w:p>
-      <w:pPr>
-        <w:pStyle w:val="BodyText"/>
-      </w:pPr>
-      <w:r>
-        <w:t xml:space="preserve">crimes the Supreme Court held that the federal government has jurisdiction over committed by or against Indians under the General Crimes Act, not that the State lacks such jurisdiction. Nor does this Court’s invocation of United States</w:t>
-      </w:r>
-    </w:p>
-    <w:p>
-      <w:pPr>
-        <w:pStyle w:val="BodyText"/>
-      </w:pPr>
-      <w:r>
-        <w:t xml:space="preserve">was v. John, 437 U.S. 634, 651 (1978) answer the question, because that case interpreting the Major Crimes Act (18 U.S.C. § 1 153), which has a text distinct from that of the General Crimes Act. Specifically, the Major Crimes Act defines</w:t>
-      </w:r>
-    </w:p>
-    <w:p>
-      <w:pPr>
-        <w:pStyle w:val="BodyText"/>
-      </w:pPr>
-      <w:r>
-        <w:t xml:space="preserve">“within the applicable law and then says punishment for violation of those laws is the exclusive jurisdiction of the United States.” 18 U.S.C. § 1153. By contrast, as stated above, the General Crimes Act merely defines the applicable law and then extends that law to the Indian Country, without saying anything about jurisdiction—leaving the presumption that federal and state courts exercise concurrent jurisdiction in place.</w:t>
-      </w:r>
-    </w:p>
-    <w:p>
-      <w:pPr>
-        <w:pStyle w:val="BodyText"/>
-      </w:pPr>
-      <w:r>
-        <w:t xml:space="preserve">Third, this Court pointed to the Kansas Act, 1$ U.S.C. § 3243, and Public Law 280, Act of Aug. 15, 1953, Pub. L. No. 67, Stat. 588, codified at 18 U.S.C. § 1162, 25 U.S.C. § 1321</w:t>
-      </w:r>
-      <w:r>
-        <w:noBreakHyphen/>
-      </w:r>
-      <w:r>
-        <w:t xml:space="preserve">26; 18 U.S.C. § 1162(a), which conferred on certain states jurisdiction over crimes by or against Indians, as implicitly recognizing that states otherwise lack jurisdiction over non Indians who offend against Indians. Bossc, 2021 OX CR3, ¶j 25</w:t>
-      </w:r>
-      <w:r>
-        <w:noBreakHyphen/>
-      </w:r>
-      <w:r>
-        <w:t xml:space="preserve">27, R3d at . However, this overlooks the State’s argument that laws like Public Law 280 also authorize state jurisdiction over “civil causes of action between Indians or to which Indians are parties,” 25 U.S.C. § 1322, even though states already have jurisdiction over civil cases brought by Indians on Indian country against non-Indian defendants (State’s Response at 18, 20 (citing, inter alia, Three Affiliated Tribes of fort Berthold Reservation v. Wold Eng’g, P.c., 467 U.S. 138, 148</w:t>
+        <w:t xml:space="preserve">27, R3d at . However, this overlooks the State’s argument that laws like Public Law 280 also authorize state jurisdiction over “civil causes of action between Indians or to which Indians are parties,” 25 U.S.C. § 1322, even though states already have jurisdiction over civil cases brought by Indians on Indian country against non-Indian defendants (State’s Response at 18, 20 (citing, inter alia, Three Affiliated Tribes of fort Berthold Reservation v. Wold Eng’g, P.c., 467 U.S. 138, 148</w:t>
       </w:r>
       <w:r>
         <w:noBreakHyphen/>
@@ -1480,7 +1461,7 @@
         <w:pStyle w:val="BodyText"/>
       </w:pPr>
       <w:r>
-        <w:t xml:space="preserve">As an initial matter, before turning to the grounds justifying rehearing, an issue of semantics must be addressed. As with some other litigants and courts, In contrast, this Court addressed, and rejected, the State’s arguments that Petitioner’s jurisdictional claim was previously available. Bosse, 2021 OK CR 3, ¶ 20 n. 8, P.3d at —. To be clear, the State strongly disagrees with this Court’s finding that ]‘vlcGirt provides a previously unavailable legal basis and contends this is contrary to the Supreme Court’s own characterization of the issue in McGirt. See, e.g., McGirt, 140 5. Ct. at 2464 (“In saying [allotment did not affect disestablishment] we say nothing new.”); see also Murphy v. Royal, 875 F.3d 896, 92 1</w:t>
+        <w:t xml:space="preserve">As an initial matter, before turning to the grounds justifying rehearing, an issue of semantics must be addressed. As with some other litigants and courts, In contrast, this Court addressed, and rejected, the State’s arguments that Petitioner’s jurisdictional claim was previously available. Bosse, 2021 OK CR 3, ¶ 20 n. 8, P.3d at —. To be clear, the State strongly disagrees with this Court’s finding that ]‘vlcGirt provides a previously unavailable legal basis and contends this is contrary to the Supreme Court’s own characterization of the issue in McGirt. See, e.g., McGirt, 140 5. Ct. at 2464 (“In saying [allotment did not affect disestablishment] we say nothing new.”); see also Murphy v. Royal, 875 F.3d 896, 92 1</w:t>
       </w:r>
       <w:r>
         <w:noBreakHyphen/>
@@ -1510,7 +1491,7 @@
         <w:noBreakHyphen/>
       </w:r>
       <w:r>
-        <w:t xml:space="preserve">7, P.3d at (Rowland, V.P.J., concurring in results); Bosse, 2021 OK CR 3, ¶ 3, P.3d at (Hudson, J., concurring in results) (“fullvjoin[ing Judge Rowland’s special writing concerning. . . the use of the term subject matter jurisdiction”), the State has preserved its arguments that the claim can be waived. Further, in holding / to the contrary, this Court has both overlooked the State’s arguments and created a conflict in the law.</w:t>
+        <w:t xml:space="preserve">7, P.3d at (Rowland, V.P.J., concurring in results); Bosse, 2021 OK CR 3, ¶ 3, P.3d at (Hudson, J., concurring in results) (“fullvjoin[ing Judge Rowland’s special writing concerning. . . the use of the term subject matter jurisdiction”), the State has preserved its arguments that the claim can be waived. Further, in holding / to the contrary, this Court has both overlooked the State’s arguments and created a conflict in the law.</w:t>
       </w:r>
     </w:p>
     <w:p>
@@ -1526,7 +1507,7 @@
         <w:pStyle w:val="BodyText"/>
       </w:pPr>
       <w:r>
-        <w:t xml:space="preserve">Second, this Court’s application of Gonzalez creates an unnecessary conflict between that case and McGirt, as well as between this Court and United States v. Cotton, on which Gonzalez relied. Cf Bosse, 137 S. Ct. at 2 (“Our decisions remain binding precedent until we see fit to reconsider them, regardless of whether subsequent cases have raised doubts about their continuing vitality.” (quotation marks omitted)). For starters, Gonzalez concerned 28 U.S.C. § 2253, a congressionally enacted limitation on federal appellate courts’ ability to hear habeas appeals, and the Court found that the particular provision at issue, § 2253(c)⁠(3), was non-jurisdictional. Id. at 139, 143. So the general statement relied on by this Court was made in a very specific statutory context not at issue in this case, and in addition it was mere dictum. See McDaniel v. Sanchez, 452 U.S. 130, 141 (1981) (dictum is a statement “unnecessary to the decision in [the] case”). In McGirt, in contrast, the Supreme Court very specifically indicated that claims regarding Indian Country jurisdiction could be barred. Thus, whatever Gonzalez meant in general by “[s]ubject-matter jurisdiction,” the phrase could not have encompassed Indian Country jurisdictional challenges. See 3osse, 2021 OK CR 3, ¶ 7 n. 2, — P.3d at (Rowland, V.RJ., concurring in results) (“The McGirt opinion tacitly acknowledges potential procedural bars . . . . Those defenses would not be relevant if subject matter jurisdiction, which is non-waivable, were concerned.”). Unsurprisingly, Petitioner himself has not argued that such challenges cannot be waived as a matter of constitutional law or that Oklahoma’s postconviction statutes are unconstitutional (App. at 16</w:t>
+        <w:t xml:space="preserve">Second, this Court’s application of Gonzalez creates an unnecessary conflict between that case and McGirt, as well as between this Court and United States v. Cotton, on which Gonzalez relied. Cf Bosse, 137 S. Ct. at 2 (“Our decisions remain binding precedent until we see fit to reconsider them, regardless of whether subsequent cases have raised doubts about their continuing vitality.” (quotation marks omitted)). For starters, Gonzalez concerned 28 U.S.C. § 2253, a congressionally enacted limitation on federal appellate courts’ ability to hear habeas appeals, and the Court found that the particular provision at issue, § 2253(c)⁠(3), was non-jurisdictional. Id. at 139, 143. So the general statement relied on by this Court was made in a very specific statutory context not at issue in this case, and in addition it was mere dictum. See McDaniel v. Sanchez, 452 U.S. 130, 141 (1981) (dictum is a statement “unnecessary to the decision in [the] case”). In McGirt, in contrast, the Supreme Court very specifically indicated that claims regarding Indian Country jurisdiction could be barred. Thus, whatever Gonzalez meant in general by “[s]ubject-matter jurisdiction,” the phrase could not have encompassed Indian Country jurisdictional challenges. See 3osse, 2021 OK CR 3, ¶ 7 n. 2, — P.3d at (Rowland, V.RJ., concurring in results) (“The McGirt opinion tacitly acknowledges potential procedural bars . . . . Those defenses would not be relevant if subject matter jurisdiction, which is non-waivable, were concerned.”). Unsurprisingly, Petitioner himself has not argued that such challenges cannot be waived as a matter of constitutional law or that Oklahoma’s postconviction statutes are unconstitutional (App. at 16</w:t>
       </w:r>
       <w:r>
         <w:noBreakHyphen/>
@@ -1546,7 +1527,7 @@
         <w:pStyle w:val="BodyText"/>
       </w:pPr>
       <w:r>
-        <w:t xml:space="preserve">In addition, as indicated, Gonzalez relied on United States u. Cotton for the propositions that “[w]hen a requirement goes to subject-matter jurisdiction, courts are obligated to consider sua sponte issues that the parties have disclaimed or have not presented,” and that “[s}ubject-matter jurisdiction can never be waived or forfeited.” Gonzalez, 565 U.S. at 141—42. Indeed, in the context of addressing defects in a federal indictment on direct appeal, Cotton said that “subject-matter jurisdiction . . . can never be forfeited or waived.” Cotton, 535 U.S. at 630. However, what this Court did not acknowledge is that Gonzalez and Cotton both explained that “subject matter jurisdiction” is about a court’s power to hear a case: “[subject matter] jurisdiction means . . . the courts’ statutory or constitutional power to adjudicate the case.” Cotton, 535 U.S. at 630 (quotation marks omitted, emphasis in original); see also id, at 630</w:t>
+        <w:t xml:space="preserve">In addition, as indicated, Gonzalez relied on United States u. Cotton for the propositions that “[w]hen a requirement goes to subject-matter jurisdiction, courts are obligated to consider sua sponte issues that the parties have disclaimed or have not presented,” and that “[s}ubject-matter jurisdiction can never be waived or forfeited.” Gonzalez, 565 U.S. at 141—42. Indeed, in the context of addressing defects in a federal indictment on direct appeal, Cotton said that “subject-matter jurisdiction . . . can never be forfeited or waived.” Cotton, 535 U.S. at 630. However, what this Court did not acknowledge is that Gonzalez and Cotton both explained that “subject matter jurisdiction” is about a court’s power to hear a case: “[subject matter] jurisdiction means . . . the courts’ statutory or constitutional power to adjudicate the case.” Cotton, 535 U.S. at 630 (quotation marks omitted, emphasis in original); see also id, at 630</w:t>
       </w:r>
       <w:r>
         <w:noBreakHyphen/>
@@ -1686,7 +1667,7 @@
         <w:pStyle w:val="BodyText"/>
       </w:pPr>
       <w:r>
-        <w:t xml:space="preserve">A few years later, as already quoted, Cotton held that “jurisdiction” means “the courts’ statutory or constitutional power to adjudicate the case,” and this “concept of subject-matter jurisdiction, because it involves a court’s power to hear a case, can never be forfeited or waived.” Cotton, 535 U.S. at 630 (quotation marks omitted). Multiple federal cases have relied on Cotton—subject matter jurisdiction is about a court’s power to adjudicate a case—and Hugi—federal courts’ power to hear a criminal case is established by § 3231— to hold that Indian Country jurisdictional claims are no non-waivable subject matter jurisdiction claims.</w:t>
+        <w:t xml:space="preserve">A few years later, as already quoted, Cotton held that “jurisdiction” means “the courts’ statutory or constitutional power to adjudicate the case,” and this “concept of subject-matter jurisdiction, because it involves a court’s power to hear a case, can never be forfeited or waived.” Cotton, 535 U.S. at 630 (quotation marks omitted). Multiple federal cases have relied on Cotton—subject matter jurisdiction is about a court’s power to adjudicate a case—and Hugi—federal courts’ power to hear a criminal case is established by § 3231—⁠ to hold that Indian Country jurisdictional claims are no non-waivable subject matter jurisdiction claims.</w:t>
       </w:r>
     </w:p>
     <w:p>
@@ -1812,7 +1793,7 @@
         <w:pStyle w:val="BodyText"/>
       </w:pPr>
       <w:r>
-        <w:t xml:space="preserve">.“); 22 0.5.2011, § 121 (“When the commission of a public offense, commenced without this state, is consummated within its boundaries, the defendant is liable to punishment therefor in this state, . . . and in such case, the jurisdiction is in the county in which the offense is consummated.”); Graham v. Lanning, 1985 OK CR 36, ¶ 5, 698 P.2d 25, 26, overruled on other grounds by Lenzy v. State, 1993 OK CR 53, ¶ 17, 864 P.2d 847, 850 (“We note at the outset that 22 O.S.198 1, § 121 confers on the District Courts of this State jurisdiction over any offense ‘commenced without this State, [and] consummated within its boundaries, . . . and. . . the jurisdiction is in the county in which the offense is consummated.”); see also generally Title 20 of the Oklahoma Statutes; Bosse, 2021 OK CR 3, ¶ 4, P.3d at (Rowland, V.P,J., concurring in results) (“The subject matter jurisdiction of Oklahoma courts is established by Article 7 of our State Constitution and Title 20 of our statutes which grant general jurisdiction, including over murder cases, to our district trial courts.”). Thus, “the subject matter in this case is a murder prosecution.” Bosse, 2021 OK CR 3, ¶J 4</w:t>
+        <w:t xml:space="preserve">.“); 22 0.5.2011, § 121 (“When the commission of a public offense, commenced without this state, is consummated within its boundaries, the defendant is liable to punishment therefor in this state, . . . and in such case, the jurisdiction is in the county in which the offense is consummated.”); Graham v. Lanning, 1985 OK CR 36, ¶ 5, 698 P.2d 25, 26, overruled on other grounds by Lenzy v. State, 1993 OK CR 53, ¶ 17, 864 P.2d 847, 850 (“We note at the outset that 22 O.S.198 1, § 121 confers on the District Courts of this State jurisdiction over any offense ‘commenced without this State, [and] consummated within its boundaries, . . . and. . . the jurisdiction is in the county in which the offense is consummated.”); see also generally Title 20 of the Oklahoma Statutes; Bosse, 2021 OK CR 3, ¶ 4, P.3d at (Rowland, V.P,J., concurring in results) (“The subject matter jurisdiction of Oklahoma courts is established by Article 7 of our State Constitution and Title 20 of our statutes which grant general jurisdiction, including over murder cases, to our district trial courts.”). Thus, “the subject matter in this case is a murder prosecution.” Bosse, 2021 OK CR 3, ¶J 4</w:t>
       </w:r>
       <w:r>
         <w:noBreakHyphen/>
@@ -1826,7 +1807,7 @@
         <w:pStyle w:val="BodyText"/>
       </w:pPr>
       <w:r>
-        <w:t xml:space="preserve">This Court’s treatment of Indian Country jurisdictional claims as non waivable subject matter jurisdiction claims that implicate the power of the trial court to adjudicate a case creates a conflict with Cotton, in particular as it has been interpreted by lower federal courts. furthermore in tension with this Court’s pronouncement that [c]onsistencv and economy of judicial resources compel us to adopt the same definition [of Indian status] as that used by the Tenth Circuit.” Bosse, 2021 OK CR3, ¶ 16, P.3d at , this Court’s decision also results in a curious dichotomy in which Indian Country jurisdictional claims can never be waived in state court but can be waived in federal court, including in the Tenth Circuit. If anything, one would expect the opposite. See United States v. Prentiss, 206 f.3d 960, 967 (10th Cir. 2000) (“Federal criminal jurisdiction is limited by federalism concerns; states retain primary criminal jurisdiction in our system.”); Application of Poston, 1955 OK CR 39, ¶ 31, 281 P.2d 776, 784 (“The district courts of Oklahoma are courts of general jurisdiction.”). The State urges this Court to grant rehearing to address this conflict.4 Respectfully, this Court’s statement that “[t]he District Attorney admits that generally litigants ‘cannot waive the argument that the district court lacks subject-matter jurisdiction,’ citing United States v. Green, 886 f.3d 1300, 1304 (10th Cir. 2018),” Bosse, B. This Court Overlooked the State’s Arguments that Indian Country</w:t>
+        <w:t xml:space="preserve">This Court’s treatment of Indian Country jurisdictional claims as non waivable subject matter jurisdiction claims that implicate the power of the trial court to adjudicate a case creates a conflict with Cotton, in particular as it has been interpreted by lower federal courts. furthermore in tension with this Court’s pronouncement that [c]onsistencv and economy of judicial resources compel us to adopt the same definition [of Indian status] as that used by the Tenth Circuit.” Bosse, 2021 OK CR3, ¶ 16, P.3d at , this Court’s decision also results in a curious dichotomy in which Indian Country jurisdictional claims can never be waived in state court but can be waived in federal court, including in the Tenth Circuit. If anything, one would expect the opposite. See United States v. Prentiss, 206 f.3d 960, 967 (10th Cir. 2000) (“Federal criminal jurisdiction is limited by federalism concerns; states retain primary criminal jurisdiction in our system.”); Application of Poston, 1955 OK CR 39, ¶ 31, 281 P.2d 776, 784 (“The district courts of Oklahoma are courts of general jurisdiction.”). The State urges this Court to grant rehearing to address this conflict.4 Respectfully, this Court’s statement that “[t]he District Attorney admits that generally litigants ‘cannot waive the argument that the district court lacks subject-matter jurisdiction,’ citing United States v. Green, 886 f.3d 1300, 1304 (10th Cir. 2018),” Bosse, B. This Court Overlooked the State’s Arguments that Indian Country</w:t>
       </w:r>
     </w:p>
     <w:p>
@@ -1856,15 +1837,15 @@
         <w:noBreakHyphen/>
       </w:r>
       <w:r>
-        <w:t xml:space="preserve">7, 124 P.3d 1198, 1200; and Wallace v. State, 1997 OK CR 18, ¶ 15, 935 P.2d 366, 372. Bosse, 2021 OK CR3, ¶ 21, P.3d at . However, this Court overlooked the State’s arguments that (zc1culy, Murphy. and Wallace are in conflict with 22 0.8.2011, § 10$9(D)⁠(8). Furthermore, this Court’s holding is in conflict with 22 0.8.2011, § 1080 and 1086, which expressly encompass jurisdictional claims and provide that they can be waived.</w:t>
-      </w:r>
-    </w:p>
-    <w:p>
-      <w:pPr>
-        <w:pStyle w:val="BodyText"/>
-      </w:pPr>
-      <w:r>
-        <w:t xml:space="preserve">First, in holding that “the limitations of post-conviction or subsequent post-conviction statutes do not apply to claims of lack of jurisdiction” based on 2021 OK CR 3, ¶ 21, P.3d at , takes the District Attorney’s citation to Green out of context. The District Attorney relied on Green to observe that ‘[i}t is not clear in the law that a defendant who argues he is an Indian in state court would be estopped from arguing the opposite in federal court” in urging this Court to clearly define Indian status (State’s Supplemental Brief at 11). More importantly, in focusing on a single citation in the State’s briefing to generate a concession on the State’s part, this Court overlooked that the State’s briefs argued at length that jurisdictional claims can be waived (State’s Response at 22</w:t>
+        <w:t xml:space="preserve">7, 124 P.3d 1198, 1200; and Wallace v. State, 1997 OK CR 18, ¶ 15, 935 P.2d 366, 372. Bosse, 2021 OK CR3, ¶ 21, P.3d at . However, this Court overlooked the State’s arguments that (zc1culy, Murphy. and Wallace are in conflict with 22 0.8.2011, § 10$9(D)⁠(8). Furthermore, this Court’s holding is in conflict with 22 0.8.2011, § 1080 and 1086, which expressly encompass jurisdictional claims and provide that they can be waived.</w:t>
+      </w:r>
+    </w:p>
+    <w:p>
+      <w:pPr>
+        <w:pStyle w:val="BodyText"/>
+      </w:pPr>
+      <w:r>
+        <w:t xml:space="preserve">First, in holding that “the limitations of post-conviction or subsequent post-conviction statutes do not apply to claims of lack of jurisdiction” based on 2021 OK CR 3, ¶ 21, P.3d at , takes the District Attorney’s citation to Green out of context. The District Attorney relied on Green to observe that ‘[i}t is not clear in the law that a defendant who argues he is an Indian in state court would be estopped from arguing the opposite in federal court” in urging this Court to clearly define Indian status (State’s Supplemental Brief at 11). More importantly, in focusing on a single citation in the State’s briefing to generate a concession on the State’s part, this Court overlooked that the State’s briefs argued at length that jurisdictional claims can be waived (State’s Response at 22</w:t>
       </w:r>
       <w:r>
         <w:noBreakHyphen/>
@@ -1882,7 +1863,7 @@
         <w:noBreakHyphen/>
       </w:r>
       <w:r>
-        <w:t xml:space="preserve">31),5 As the State asserted, “ 1089 . . . limit[s] successive filings to two categories— those with certain previously unavailable legal grounds and those with certain previously unavailable factual grounds”—and the “statute provides [no] exception to its restrictions for challenges to the trial court’s subject matter jurisdiction” (State’s Response at 34). Thus this Court’s judicially created exception for jurisdictional challenges in Wackerly and Murphy impermissiblv “contravenes legislative intent” (State’s Response at 38</w:t>
+        <w:t xml:space="preserve">31),5 As the State asserted, “ 1089 . . . limit[s] successive filings to two categories— those with certain previously unavailable legal grounds and those with certain previously unavailable factual grounds”—and the “statute provides [no] exception to its restrictions for challenges to the trial court’s subject matter jurisdiction” (State’s Response at 34). Thus this Court’s judicially created exception for jurisdictional challenges in Wackerly and Murphy impermissiblv “contravenes legislative intent” (State’s Response at 38</w:t>
       </w:r>
       <w:r>
         <w:noBreakHyphen/>
@@ -1948,7 +1929,7 @@
         <w:pStyle w:val="BodyText"/>
       </w:pPr>
       <w:r>
-        <w:t xml:space="preserve">Second, relatedly, this Court’s determination that “the limitations of post- conviction or subsequent post-conviction statutes do not apply to claims of lack of jurisdiction,” Bosse, 2021 OK CR 3, ¶ 21, P.3d at , is squarely in conflict 6 Likewise, in the context of federal motions to vacate sentence under 28 U.S.C. § 2255, the parallel for federal prisoners to habeas petitions by state prisoners, “courts have uniformly rejected” the contention that the statute of limitations in § 2255 does not apply to jurisdictional claims because “ 2255 itself expressly contemplates challenges to a sentencing court’s jurisdiction without in any way indicating that these particular sorts of attacks need not be brought within the statute’s one-year period of limitation.” Wallace v. United States, 981 F. Supp. 2d 1160, 1166 (N.D. Ala. 2013) (quotation marks omitted) (collecting cases). with clear language in § 1080 and 1086. Section 1080 expressly encompasses jurisdictional challenges: “Any person who has been convicted of, or sentenced for, a crime and who claims:. . . that the court was without jurisdiction to impose sentence . . . may institute a proceeding under this act . . . .“ 22 0.5.2011, § 1080(b) (emphasis added). Furthermore, § 1086, regarding successive non- capital post-conviction applications, says that “[a]ll grounds for relief available to an applicant under this act must be raised in his original, supplemental or amended application” and may not be the basis of a successive post-conviction application unless “sufficient reason” for the failure to do so is shown. 22 O.S.2011, § 1086 (emphasis added). Thus, the Oklahoma Legislature said “all” claims “must be raised” at the first opportunity—and said so in spite of its explicit recognition that challenges to the trial court’s jurisdiction may be raised. Compare 22 0.5.2011, § 1080(b), with 22 0.S.2011, § 1086; see also Wallace, 981 F. Supp. 2d at 1166 (“[Section] 2255 itself expressly contemplates challenges to a sentencing court’s jurisdiction without in any way indicating that these particular sorts of attacks need not be brought within the statute’s one-year period of limitation.” (quotation marks omitted)).7 The Legislature clearly made jurisdictional claims subject to the provisions of the post-conviction statutes, Indeed, this Court relied on § 1080(b) in recently holding that a defendant raising a McGirt claim could not bypass the statutory post-conviction procedures and bring her claim in a state habeas petition. State u. Canavan, Case No. PR</w:t>
+        <w:t xml:space="preserve">Second, relatedly, this Court’s determination that “the limitations of post- conviction or subsequent post-conviction statutes do not apply to claims of lack of jurisdiction,” Bosse, 2021 OK CR 3, ¶ 21, P.3d at , is squarely in conflict 6 Likewise, in the context of federal motions to vacate sentence under 28 U.S.C. § 2255, the parallel for federal prisoners to habeas petitions by state prisoners, “courts have uniformly rejected” the contention that the statute of limitations in § 2255 does not apply to jurisdictional claims because “ 2255 itself expressly contemplates challenges to a sentencing court’s jurisdiction without in any way indicating that these particular sorts of attacks need not be brought within the statute’s one-year period of limitation.” Wallace v. United States, 981 F. Supp. 2d 1160, 1166 (N.D. Ala. 2013) (quotation marks omitted) (collecting cases). with clear language in § 1080 and 1086. Section 1080 expressly encompasses jurisdictional challenges: “Any person who has been convicted of, or sentenced for, a crime and who claims:. . . that the court was without jurisdiction to impose sentence . . . may institute a proceeding under this act . . . .“ 22 0.5.2011, § 1080(b) (emphasis added). Furthermore, § 1086, regarding successive non- capital post-conviction applications, says that “[a]ll grounds for relief available to an applicant under this act must be raised in his original, supplemental or amended application” and may not be the basis of a successive post-conviction application unless “sufficient reason” for the failure to do so is shown. 22 O.S.2011, § 1086 (emphasis added). Thus, the Oklahoma Legislature said “all” claims “must be raised” at the first opportunity—and said so in spite of its explicit recognition that challenges to the trial court’s jurisdiction may be raised. Compare 22 0.5.2011, § 1080(b), with 22 0.S.2011, § 1086; see also Wallace, 981 F. Supp. 2d at 1166 (“[Section] 2255 itself expressly contemplates challenges to a sentencing court’s jurisdiction without in any way indicating that these particular sorts of attacks need not be brought within the statute’s one-year period of limitation.” (quotation marks omitted)).7 The Legislature clearly made jurisdictional claims subject to the provisions of the post-conviction statutes, Indeed, this Court relied on § 1080(b) in recently holding that a defendant raising a McGirt claim could not bypass the statutory post-conviction procedures and bring her claim in a state habeas petition. State u. Canavan, Case No. PR</w:t>
       </w:r>
       <w:r>
         <w:noBreakHyphen/>
@@ -1982,7 +1963,7 @@
         <w:noBreakHyphen/>
       </w:r>
       <w:r>
-        <w:t xml:space="preserve">79, 162 P.2d 205, 207 (1945) (State’s Response at 46). As explained by the State, in Ex parte Wallace, “the defendant filed a state habeas petition three years after his guilty plea alleging that the federal court had exclusive jurisdiction over his crime because he and his rape victims were Comanche Indians and the crime occurred on a restricted allotment.” (State’s 8 The State did not rely on § 1080 and 1086 in its Response and Supplemental Brief because this is a capital case subject to § 1089. However, in broadly holding that “the limitations of post-conviction or subsequent post-conviction statutes do not apply to claims of lack of jurisdiction,” Bosse, 2021 OK CR 3, ¶ 21, — P.3d at —,this Court has created a clear conflict with these non-capital post-conviction statutes, see Rule 3.14(B)⁠(2), Rules of the Oklahoma Court of Criminal Appeals, Title 22, Ch. 18, App. (2011). And there is nothing in § 1089 that indicates the Legislature intended to exempt jurisdictional claims from the requirement—which appears in both § 1086 and § 1089— that every claim be brought at the first available opportunity. Response at 46). “Although this Court did not invoke the word ‘laches,’ it ultimately concluded that ‘at this late date’ it would not consider the defendant’s jurisdictional attack, noting in particular that the statute of limitations for any federal action against the defendant had lapsed.” (State’s Response at 56 (quoting Exparte Wallace, 81 Okla. Crim. at 179, 188, 162 P.2d at 207, 211)). This Court was clearly applying the doctrine of laches in Ex parte Wallace to an Indian Country jurisdictional claim. Respectfully, this Court’s statement in this case that the State did not identify any case in which this Court applied laches to a jurisdictional challenge is incorrect. The State urges this Court to clarify, at the very least, that the doctrine of laches may apply, on a case-by-case basis, to Indian Country jurisdictional claims where any applicable federal or tribal statute of limitations has expired. See, e.g., Worthington u. State, Case No. PC- 2020</w:t>
+        <w:t xml:space="preserve">79, 162 P.2d 205, 207 (1945) (State’s Response at 46). As explained by the State, in Ex parte Wallace, “the defendant filed a state habeas petition three years after his guilty plea alleging that the federal court had exclusive jurisdiction over his crime because he and his rape victims were Comanche Indians and the crime occurred on a restricted allotment.” (State’s 8 The State did not rely on § 1080 and 1086 in its Response and Supplemental Brief because this is a capital case subject to § 1089. However, in broadly holding that “the limitations of post-conviction or subsequent post-conviction statutes do not apply to claims of lack of jurisdiction,” Bosse, 2021 OK CR 3, ¶ 21, — P.3d at —,this Court has created a clear conflict with these non-capital post-conviction statutes, see Rule 3.14(B)⁠(2), Rules of the Oklahoma Court of Criminal Appeals, Title 22, Ch. 18, App. (2011). And there is nothing in § 1089 that indicates the Legislature intended to exempt jurisdictional claims from the requirement—which appears in both § 1086 and § 1089—⁠ that every claim be brought at the first available opportunity. Response at 46). “Although this Court did not invoke the word ‘laches,’ it ultimately concluded that ‘at this late date’ it would not consider the defendant’s jurisdictional attack, noting in particular that the statute of limitations for any federal action against the defendant had lapsed.” (State’s Response at 56 (quoting Exparte Wallace, 81 Okla. Crim. at 179, 188, 162 P.2d at 207, 211)). This Court was clearly applying the doctrine of laches in Ex parte Wallace to an Indian Country jurisdictional claim. Respectfully, this Court’s statement in this case that the State did not identify any case in which this Court applied laches to a jurisdictional challenge is incorrect. The State urges this Court to clarify, at the very least, that the doctrine of laches may apply, on a case-by-case basis, to Indian Country jurisdictional claims where any applicable federal or tribal statute of limitations has expired. See, e.g., Worthington u. State, Case No. PC- 2020</w:t>
       </w:r>
       <w:r>
         <w:noBreakHyphen/>
@@ -3519,6 +3500,7 @@
     <w:unhideWhenUsed/>
     <w:qFormat/>
     <w:pPr>
+      <w:keepLines/>
       <w:spacing w:before="0" w:after="140" w:line="299" w:lineRule="exact"/>
     </w:pPr>
     <w:rPr>
@@ -3769,6 +3751,33 @@
     <w:pPr>
       <w:spacing w:before="0" w:after="0" w:line="299" w:lineRule="exact"/>
       <w:ind w:left="2160" w:hanging="720"/>
+    </w:pPr>
+  </w:style>
+  <w:style w:type="paragraph" w:customStyle="1" w:styleId="XdQuoteList1">
+    <w:name w:val="Xd Quote List 1"/>
+    <w:basedOn w:val="Normal"/>
+    <w:qFormat/>
+    <w:pPr>
+      <w:spacing w:before="0" w:after="0" w:line="299" w:lineRule="exact"/>
+      <w:ind w:left="1440" w:right="720" w:hanging="720"/>
+    </w:pPr>
+  </w:style>
+  <w:style w:type="paragraph" w:customStyle="1" w:styleId="XdQuoteList2">
+    <w:name w:val="Xd Quote List 2"/>
+    <w:basedOn w:val="Normal"/>
+    <w:qFormat/>
+    <w:pPr>
+      <w:spacing w:before="0" w:after="0" w:line="299" w:lineRule="exact"/>
+      <w:ind w:left="2160" w:right="720" w:hanging="720"/>
+    </w:pPr>
+  </w:style>
+  <w:style w:type="paragraph" w:customStyle="1" w:styleId="XdQuoteList3">
+    <w:name w:val="Xd Quote List 3"/>
+    <w:basedOn w:val="Normal"/>
+    <w:qFormat/>
+    <w:pPr>
+      <w:spacing w:before="0" w:after="0" w:line="299" w:lineRule="exact"/>
+      <w:ind w:left="2880" w:right="720" w:hanging="720"/>
     </w:pPr>
   </w:style>
   <w:style w:type="paragraph" w:customStyle="1" w:styleId="SourceCode">

</xml_diff>